<commit_message>
docs: expand IEEE project report (implementation through appendix)
Co-authored-by: Cursor <cursoragent@cursor.com>
</commit_message>
<xml_diff>
--- a/docs/IEEE-GH-AI-Project-Report.docx
+++ b/docs/IEEE-GH-AI-Project-Report.docx
@@ -357,7 +357,7 @@
         <w:pStyle w:val="Heading1"/>
       </w:pPr>
       <w:r>
-        <w:t>V. IMPLEMENTATION</w:t>
+        <w:t>V. IMPLEMENTATION (DETAILED)</w:t>
       </w:r>
     </w:p>
     <w:p>
@@ -365,12 +365,12 @@
         <w:pStyle w:val="Heading2"/>
       </w:pPr>
       <w:r>
-        <w:t>A. Frontend Implementation</w:t>
+        <w:t>V.A. Frontend stack and build pipeline</w:t>
       </w:r>
     </w:p>
     <w:p>
       <w:r>
-        <w:t>The App Router organizes marketing routes under route groups and dashboard routes under authenticated layout assumptions. Server components prefetch dashboard data where feasible; client components manage interactive forms. Static imports bundle founder imagery for deterministic build output on edge hosts.</w:t>
+        <w:t>The client application targets Node.js 20+ and ships with Next.js 15.2.8 and React 19. Styling uses Tailwind CSS with a shared component layer under `src/components/ui` (Radix primitives). Production builds run `next build`, emitting optimized bundles, route manifests, and server action / RSC payloads where applicable. TypeScript enforces static typing across pages and libraries. ESLint (`eslint-config-next`) guards common footguns. The `next.config.ts` file enables `outputFileTracingRoot` pointing at the monorepo parent so that file tracing in container and multi-root deployments resolves shared paths consistently. Marketing routes live under the `(marketing)` route group; authenticated dashboard routes live under `(dashboard)` with layout-level assumptions for session-bearing requests.</w:t>
       </w:r>
     </w:p>
     <w:p>
@@ -378,12 +378,12 @@
         <w:pStyle w:val="Heading2"/>
       </w:pPr>
       <w:r>
-        <w:t>B. Backend Implementation</w:t>
+        <w:t>V.B. Same-origin API proxy (`/api/v1/*`)</w:t>
       </w:r>
     </w:p>
     <w:p>
       <w:r>
-        <w:t>FastAPI modules separate routers, schemas, services, and models. Dependency injection supplies database sessions and current user resolution. SlowAPI integrates rate limiting with a global exception handler returning HTTP 429 JSON bodies.</w:t>
+        <w:t>Browser code calls `NEXT_PUBLIC_API_URL` defaulting to `/api/v1`. The App Router handler at `src/app/api/v1/[...route]/route.ts` forwards method, headers, query string, and body to `BACKEND_INTERNAL_URL` suffixed with `/api/v1/...`. Cookie headers are forwarded so that cookie-based sessions remain coherent when the FastAPI stack issues `Set-Cookie`. This pattern avoids exposing the internal API hostname to the browser and simplifies CORS configuration during development. Operators must set `BACKEND_INTERNAL_URL` to the full origin of the Python service in every environment (e.g., `http://127.0.0.1:8000` locally, `https://api.example.com` in production).</w:t>
       </w:r>
     </w:p>
     <w:p>
@@ -391,12 +391,88 @@
         <w:pStyle w:val="Heading2"/>
       </w:pPr>
       <w:r>
-        <w:t>C. Asynchronous Persistence</w:t>
+        <w:t>V.C. Dashboard feature modules (user-visible)</w:t>
       </w:r>
     </w:p>
     <w:p>
       <w:r>
-        <w:t>SQLAlchemy 2.x async with asyncpg reduces thread pool overhead under concurrent IO-bound workloads typical of web APIs.</w:t>
+        <w:rPr>
+          <w:rFonts w:ascii="Calibri" w:hAnsi="Calibri"/>
+          <w:sz w:val="20"/>
+        </w:rPr>
+        <w:t>| Module | Primary responsibility |</w:t>
+      </w:r>
+    </w:p>
+    <w:p>
+      <w:r>
+        <w:rPr>
+          <w:rFonts w:ascii="Calibri" w:hAnsi="Calibri"/>
+          <w:sz w:val="20"/>
+        </w:rPr>
+        <w:t>|--------|-------------------------|</w:t>
+      </w:r>
+    </w:p>
+    <w:p>
+      <w:r>
+        <w:rPr>
+          <w:rFonts w:ascii="Calibri" w:hAnsi="Calibri"/>
+          <w:sz w:val="20"/>
+        </w:rPr>
+        <w:t>| Dashboard home | Server-side fetch of pipeline metrics and lead summaries using `BACKEND_INTERNAL_URL` with forwarded cookies. |</w:t>
+      </w:r>
+    </w:p>
+    <w:p>
+      <w:r>
+        <w:rPr>
+          <w:rFonts w:ascii="Calibri" w:hAnsi="Calibri"/>
+          <w:sz w:val="20"/>
+        </w:rPr>
+        <w:t>| Leads | Client-side CRUD against `/api/v1/leads/` for list and create; detail routes hydrate lead threads. |</w:t>
+      </w:r>
+    </w:p>
+    <w:p>
+      <w:r>
+        <w:rPr>
+          <w:rFonts w:ascii="Calibri" w:hAnsi="Calibri"/>
+          <w:sz w:val="20"/>
+        </w:rPr>
+        <w:t>| Campaigns | Defines trigger type (`new_lead` default), optional delay days, subject/body templates; persists via `/api/v1/campaigns/`. |</w:t>
+      </w:r>
+    </w:p>
+    <w:p>
+      <w:r>
+        <w:rPr>
+          <w:rFonts w:ascii="Calibri" w:hAnsi="Calibri"/>
+          <w:sz w:val="20"/>
+        </w:rPr>
+        <w:t>| AI Agent | Calls `/api/v1/ai-agent/*` for draft generation; operator remains accountable for sent content. |</w:t>
+      </w:r>
+    </w:p>
+    <w:p>
+      <w:r>
+        <w:rPr>
+          <w:rFonts w:ascii="Calibri" w:hAnsi="Calibri"/>
+          <w:sz w:val="20"/>
+        </w:rPr>
+        <w:t>| Calendly | OAuth/token flows and booking link creation endpoints; webhook ingestion updates pipeline context. |</w:t>
+      </w:r>
+    </w:p>
+    <w:p>
+      <w:r>
+        <w:rPr>
+          <w:rFonts w:ascii="Calibri" w:hAnsi="Calibri"/>
+          <w:sz w:val="20"/>
+        </w:rPr>
+        <w:t>| API keys | User-scoped programmatic keys stored as hash + prefix only (`ApiKey` model). |</w:t>
+      </w:r>
+    </w:p>
+    <w:p>
+      <w:r>
+        <w:rPr>
+          <w:rFonts w:ascii="Calibri" w:hAnsi="Calibri"/>
+          <w:sz w:val="20"/>
+        </w:rPr>
+        <w:t>| Settings / Billing | Profile and placeholder billing surfaces for future monetization. |</w:t>
       </w:r>
     </w:p>
     <w:p>
@@ -404,12 +480,196 @@
         <w:pStyle w:val="Heading2"/>
       </w:pPr>
       <w:r>
-        <w:t>D. Integrations</w:t>
+        <w:t>V.D. Backend process model</w:t>
       </w:r>
     </w:p>
     <w:p>
       <w:r>
-        <w:t>Calendly and Gmail integrations require OAuth client configuration and secure token storage patterns; webhook endpoints must be publicly reachable in production (tunneling during development).</w:t>
+        <w:t>The ASGI application is served by Uvicorn (development with `--reload`; production behind a process manager or container entrypoint). Request lifecycle: routing → optional rate limit → CORS → endpoint → dependency-injected `AsyncSession` → service layer → SQLAlchemy flush/commit. Exceptions map to JSON error bodies suitable for SPA consumption.</w:t>
+      </w:r>
+    </w:p>
+    <w:p>
+      <w:pPr>
+        <w:pStyle w:val="Heading2"/>
+      </w:pPr>
+      <w:r>
+        <w:t>V.E. Authentication and session policy</w:t>
+      </w:r>
+    </w:p>
+    <w:p>
+      <w:r>
+        <w:t>`ACCESS_TOKEN_EXPIRE_MINUTES` (default 30) and `REFRESH_TOKEN_EXPIRE_DAYS` (default 7) are centralized in `Settings`. Passwords are stored hashed in `users.hashed_password`. Tokens are issued by auth routers (see OpenAPI `/docs`). Refresh and rotation policies should be tightened for high-security tenants.</w:t>
+      </w:r>
+    </w:p>
+    <w:p>
+      <w:pPr>
+        <w:pStyle w:val="Heading2"/>
+      </w:pPr>
+      <w:r>
+        <w:t>V.F. Rate limiting</w:t>
+      </w:r>
+    </w:p>
+    <w:p>
+      <w:r>
+        <w:t>SlowAPI attaches to application state; `RateLimitExceeded` returns HTTP 429 with JSON `{"detail":"Rate limit exceeded"}`. Limits should be tuned per route class: authentication endpoints warrant stricter thresholds than read-only marketing proxies.</w:t>
+      </w:r>
+    </w:p>
+    <w:p>
+      <w:pPr>
+        <w:pStyle w:val="Heading2"/>
+      </w:pPr>
+      <w:r>
+        <w:t>V.G. Database schema (relational core)</w:t>
+      </w:r>
+    </w:p>
+    <w:p>
+      <w:r>
+        <w:t>PostgreSQL holds authoritative rows for:</w:t>
+      </w:r>
+    </w:p>
+    <w:p>
+      <w:r>
+        <w:t>- `users`: `id` (UUID PK), unique `email`, `hashed_password`, optional `full_name`, `company`, encrypted or opaque `gmail_refresh_token`, `calendly_token`, JSONB `ai_config`, `timezone`, JSONB `working_hours`, timestamps. Relationships: `leads`, `email_logs`, `campaigns`, `calendly_events`, `api_keys`.</w:t>
+      </w:r>
+    </w:p>
+    <w:p>
+      <w:r>
+        <w:t>- `leads`: `id`, `user_id` FK CASCADE, `name`, `email`, optional `company`, `pipeline_stage` (string; canonical values include `New Lead`, `Contacted`, `Meeting Scheduled`, `Closed`), `notes`, `last_contacted_at`, `assigned_agent` boolean, `created_at`. Related `email_history`, `calendly_events`.</w:t>
+      </w:r>
+    </w:p>
+    <w:p>
+      <w:r>
+        <w:t>- `campaigns`: `user_id`, `name`, `trigger_type`, optional `trigger_days`, `subject`, `body`, `created_at`.</w:t>
+      </w:r>
+    </w:p>
+    <w:p>
+      <w:r>
+        <w:t>- `email_logs`: optional `lead_id` SET NULL on lead delete, `user_id`, `subject`, `body`, `sent_at`, `status`, `provider_message_id`, `direction` default `outbound`.</w:t>
+      </w:r>
+    </w:p>
+    <w:p>
+      <w:r>
+        <w:t>- `calendly_events`: optional `lead_id`, `user_id`, `calendly_event_uri`, `status`, `booked_at`, JSONB `raw_payload` for auditing webhook payloads.</w:t>
+      </w:r>
+    </w:p>
+    <w:p>
+      <w:r>
+        <w:t>- `api_keys`: `user_id`, `name`, unique `key_hash`, `key_prefix`, `created_at`, optional `revoked_at`.</w:t>
+      </w:r>
+    </w:p>
+    <w:p>
+      <w:r>
+        <w:t>- `waitlist`: marketing capture for pre-launch emails (see waitlist endpoint).</w:t>
+      </w:r>
+    </w:p>
+    <w:p>
+      <w:r>
+        <w:t>Foreign keys use `ON DELETE CASCADE` for user-owned children where orphan rows are meaningless; `SET NULL` where historical logs must survive lead deletion.</w:t>
+      </w:r>
+    </w:p>
+    <w:p>
+      <w:pPr>
+        <w:pStyle w:val="Heading2"/>
+      </w:pPr>
+      <w:r>
+        <w:t>V.H. Alembic migrations</w:t>
+      </w:r>
+    </w:p>
+    <w:p>
+      <w:r>
+        <w:t>Schema evolution is tracked under `backend/alembic/`. Operators must run `alembic upgrade head` on every deploy before serving traffic. Downgrades should be rehearsed in staging.</w:t>
+      </w:r>
+    </w:p>
+    <w:p>
+      <w:pPr>
+        <w:pStyle w:val="Heading2"/>
+      </w:pPr>
+      <w:r>
+        <w:t>V.I. Celery worker surface</w:t>
+      </w:r>
+    </w:p>
+    <w:p>
+      <w:r>
+        <w:t>`docker-compose.yml` defines a `celery` service: `celery -A app.tasks.celery_app worker -l info`, sharing the backend image and `.env`. Tasks include asynchronous email sends and scoring (see `app/tasks`). Workers require Redis connectivity identical to the API.</w:t>
+      </w:r>
+    </w:p>
+    <w:p>
+      <w:pPr>
+        <w:pStyle w:val="Heading2"/>
+      </w:pPr>
+      <w:r>
+        <w:t>V.J. External integrations (engineering detail)</w:t>
+      </w:r>
+    </w:p>
+    <w:p>
+      <w:r>
+        <w:t>OpenAI: `OPENAI_API_KEY` in settings; AI routes must guard against prompt injection by validating and truncating user-supplied strings before model calls. Gmail: OAuth client id/secret plus per-user refresh token storage on `User`. Calendly: personal token for server operations; webhooks at `/webhooks/calendly` and duplicate mount for path-prefixed proxies. Contact / waitlist: dedicated FastAPI routes log or persist submissions.</w:t>
+      </w:r>
+    </w:p>
+    <w:p>
+      <w:pPr>
+        <w:pStyle w:val="Heading2"/>
+      </w:pPr>
+      <w:r>
+        <w:t>V.K. Observability and logging</w:t>
+      </w:r>
+    </w:p>
+    <w:p>
+      <w:r>
+        <w:t>Python `logging` records contact submissions and operational warnings (e.g., readiness failures). Correlation IDs may be added later via middleware.</w:t>
+      </w:r>
+    </w:p>
+    <w:p>
+      <w:pPr>
+        <w:pStyle w:val="Heading2"/>
+      </w:pPr>
+      <w:r>
+        <w:t>V.L. Frontend environment contract</w:t>
+      </w:r>
+    </w:p>
+    <w:p>
+      <w:r>
+        <w:rPr>
+          <w:rFonts w:ascii="Calibri" w:hAnsi="Calibri"/>
+          <w:sz w:val="20"/>
+        </w:rPr>
+        <w:t>| Variable | Role |</w:t>
+      </w:r>
+    </w:p>
+    <w:p>
+      <w:r>
+        <w:rPr>
+          <w:rFonts w:ascii="Calibri" w:hAnsi="Calibri"/>
+          <w:sz w:val="20"/>
+        </w:rPr>
+        <w:t>|----------|------|</w:t>
+      </w:r>
+    </w:p>
+    <w:p>
+      <w:r>
+        <w:rPr>
+          <w:rFonts w:ascii="Calibri" w:hAnsi="Calibri"/>
+          <w:sz w:val="20"/>
+        </w:rPr>
+        <w:t>| `BACKEND_INTERNAL_URL` | Origin of FastAPI for server-side fetches and proxy target assembly. |</w:t>
+      </w:r>
+    </w:p>
+    <w:p>
+      <w:r>
+        <w:rPr>
+          <w:rFonts w:ascii="Calibri" w:hAnsi="Calibri"/>
+          <w:sz w:val="20"/>
+        </w:rPr>
+        <w:t>| `NEXT_PUBLIC_API_URL` | Browser-relative API prefix (default `/api/v1`). |</w:t>
+      </w:r>
+    </w:p>
+    <w:p>
+      <w:r>
+        <w:rPr>
+          <w:rFonts w:ascii="Calibri" w:hAnsi="Calibri"/>
+          <w:sz w:val="20"/>
+        </w:rPr>
+        <w:t>| `NEXT_PUBLIC_APP_NAME` | Branding string in UI. |</w:t>
       </w:r>
     </w:p>
     <w:p>
@@ -422,7 +682,7 @@
         <w:pStyle w:val="Heading1"/>
       </w:pPr>
       <w:r>
-        <w:t>VI. DEPLOYMENT ENGINEERING</w:t>
+        <w:t>VI. DEPLOYMENT ENGINEERING (EXPANDED)</w:t>
       </w:r>
     </w:p>
     <w:p>
@@ -430,12 +690,12 @@
         <w:pStyle w:val="Heading2"/>
       </w:pPr>
       <w:r>
-        <w:t>A. Source Control (GitHub)</w:t>
+        <w:t>VI.A. GitHub repository layout</w:t>
       </w:r>
     </w:p>
     <w:p>
       <w:r>
-        <w:t>All changes flow through Git with `main` as production. Pull requests (recommended) gate review. Tags may mark releases.</w:t>
+        <w:t>The monorepo hosts `frontend/`, `backend/`, `docs/`, `docker-compose.yml`, `README.md`, and `DEPLOY.md`. Branch `main` is production. Feature branches merge via pull request where team policy requires review.</w:t>
       </w:r>
     </w:p>
     <w:p>
@@ -443,12 +703,75 @@
         <w:pStyle w:val="Heading2"/>
       </w:pPr>
       <w:r>
-        <w:t>B. Continuous Deployment (Vercel)</w:t>
+        <w:t>VI.B. Local Docker Compose topology</w:t>
       </w:r>
     </w:p>
     <w:p>
       <w:r>
-        <w:t>The frontend directory is designated as the Vercel Root Directory so that framework detection and `npm ci` operate on the correct `package-lock.json`. Environment variables must mirror production secrets policy. Automatic deployments trigger on pushes to `main`.</w:t>
+        <w:rPr>
+          <w:rFonts w:ascii="Calibri" w:hAnsi="Calibri"/>
+          <w:sz w:val="20"/>
+        </w:rPr>
+        <w:t>| Service | Image / build | Ports | Purpose |</w:t>
+      </w:r>
+    </w:p>
+    <w:p>
+      <w:r>
+        <w:rPr>
+          <w:rFonts w:ascii="Calibri" w:hAnsi="Calibri"/>
+          <w:sz w:val="20"/>
+        </w:rPr>
+        <w:t>|---------|---------------|-------|---------|</w:t>
+      </w:r>
+    </w:p>
+    <w:p>
+      <w:r>
+        <w:rPr>
+          <w:rFonts w:ascii="Calibri" w:hAnsi="Calibri"/>
+          <w:sz w:val="20"/>
+        </w:rPr>
+        <w:t>| `db` | `postgres:15` | 5432 | Primary relational store (`ghai` database). |</w:t>
+      </w:r>
+    </w:p>
+    <w:p>
+      <w:r>
+        <w:rPr>
+          <w:rFonts w:ascii="Calibri" w:hAnsi="Calibri"/>
+          <w:sz w:val="20"/>
+        </w:rPr>
+        <w:t>| `redis` | `redis:7-alpine` | 6379 | Celery broker and cache substrate. |</w:t>
+      </w:r>
+    </w:p>
+    <w:p>
+      <w:r>
+        <w:rPr>
+          <w:rFonts w:ascii="Calibri" w:hAnsi="Calibri"/>
+          <w:sz w:val="20"/>
+        </w:rPr>
+        <w:t>| `backend` | `./backend` Dockerfile | 8000 | Runs `alembic upgrade head` then `uvicorn`. |</w:t>
+      </w:r>
+    </w:p>
+    <w:p>
+      <w:r>
+        <w:rPr>
+          <w:rFonts w:ascii="Calibri" w:hAnsi="Calibri"/>
+          <w:sz w:val="20"/>
+        </w:rPr>
+        <w:t>| `celery` | same image as backend | — | Background worker process. |</w:t>
+      </w:r>
+    </w:p>
+    <w:p>
+      <w:r>
+        <w:rPr>
+          <w:rFonts w:ascii="Calibri" w:hAnsi="Calibri"/>
+          <w:sz w:val="20"/>
+        </w:rPr>
+        <w:t>| `frontend` | `./frontend` Dockerfile | 3000 | Next.js dev/prod server. |</w:t>
+      </w:r>
+    </w:p>
+    <w:p>
+      <w:r>
+        <w:t>`backend` and `celery` mount `./backend/.env`; `frontend` mounts `./frontend/.env.local`. Persistent Postgres data uses named volume `postgres_data`.</w:t>
       </w:r>
     </w:p>
     <w:p>
@@ -456,12 +779,12 @@
         <w:pStyle w:val="Heading2"/>
       </w:pPr>
       <w:r>
-        <w:t>C. Backend Hosting</w:t>
+        <w:t>VI.C. Vercel frontend production</w:t>
       </w:r>
     </w:p>
     <w:p>
       <w:r>
-        <w:t>The API should run on a container-friendly platform with horizontal scaling options. Health checks should target `/health` and `/health/ready`.</w:t>
+        <w:t>Root Directory must be `frontend`. Framework auto-detection reads `package.json` `dependencies.next`. Do not combine root-level `vercel.json` with `npm ci --prefix frontend` when the project root is already `frontend`—that pattern double-prefixes paths and fails in seconds. Environment variables in Vercel must include production `BACKEND_INTERNAL_URL` and appropriate `CORS_ORIGINS` entries on the API host listing the Vercel hostname.</w:t>
       </w:r>
     </w:p>
     <w:p>
@@ -469,12 +792,38 @@
         <w:pStyle w:val="Heading2"/>
       </w:pPr>
       <w:r>
-        <w:t>D. Database Hosting</w:t>
+        <w:t>VI.D. Backend production hosting (recommended patterns)</w:t>
       </w:r>
     </w:p>
     <w:p>
       <w:r>
-        <w:t>Managed PostgreSQL (e.g., Neon) simplifies TLS and failover; connection strings must use `postgresql+asyncpg://` driver prefix for this codebase.</w:t>
+        <w:t>Deploy FastAPI on a VM, PaaS container, or Kubernetes with: (1) HTTPS termination; (2) at least two Uvicorn workers or Gunicorn+Uvicorn workers; (3) liveness on `/health`; (4) readiness on `/health/ready` including DB check; (5) secrets from a managed vault; (6) horizontal autoscaling rules based on CPU and p95 latency.</w:t>
+      </w:r>
+    </w:p>
+    <w:p>
+      <w:pPr>
+        <w:pStyle w:val="Heading2"/>
+      </w:pPr>
+      <w:r>
+        <w:t>VI.E. Managed PostgreSQL</w:t>
+      </w:r>
+    </w:p>
+    <w:p>
+      <w:r>
+        <w:t>Neon/RDS/Cloud SQL: enforce TLS, rotate credentials, enable automated backups, configure `max_connections` to exceed peak API+worker concurrency with headroom.</w:t>
+      </w:r>
+    </w:p>
+    <w:p>
+      <w:pPr>
+        <w:pStyle w:val="Heading2"/>
+      </w:pPr>
+      <w:r>
+        <w:t>VI.F. Rollback strategy</w:t>
+      </w:r>
+    </w:p>
+    <w:p>
+      <w:r>
+        <w:t>Tag Docker images and Git releases. Database backward compatibility requires additive migrations before destructive drops. Vercel instant rollback promotes a prior deployment artifact.</w:t>
       </w:r>
     </w:p>
     <w:p>
@@ -487,12 +836,113 @@
         <w:pStyle w:val="Heading1"/>
       </w:pPr>
       <w:r>
-        <w:t>VII. SECURITY AND PRIVACY CONSIDERATIONS</w:t>
+        <w:t>VII. SECURITY AND PRIVACY (EXPANDED)</w:t>
+      </w:r>
+    </w:p>
+    <w:p>
+      <w:pPr>
+        <w:pStyle w:val="Heading2"/>
+      </w:pPr>
+      <w:r>
+        <w:t>VII.A. Threat catalog (representative)</w:t>
       </w:r>
     </w:p>
     <w:p>
       <w:r>
-        <w:t>Threats include credential theft, CSRF on state-changing routes, rate-based abuse, and injection into LLM prompts. Mitigations include HTTPS everywhere in production, HttpOnly cookies where applicable, server-side validation with Pydantic, rate limits, and least-privilege API keys for third-party services. Privacy posture must be documented separately for GDPR-class obligations if EU data subjects are served.</w:t>
+        <w:rPr>
+          <w:rFonts w:ascii="Calibri" w:hAnsi="Calibri"/>
+          <w:sz w:val="20"/>
+        </w:rPr>
+        <w:t>| Threat ID | Description | Mitigation |</w:t>
+      </w:r>
+    </w:p>
+    <w:p>
+      <w:r>
+        <w:rPr>
+          <w:rFonts w:ascii="Calibri" w:hAnsi="Calibri"/>
+          <w:sz w:val="20"/>
+        </w:rPr>
+        <w:t>|-----------|-------------|------------|</w:t>
+      </w:r>
+    </w:p>
+    <w:p>
+      <w:r>
+        <w:rPr>
+          <w:rFonts w:ascii="Calibri" w:hAnsi="Calibri"/>
+          <w:sz w:val="20"/>
+        </w:rPr>
+        <w:t>| T-01 | Credential stuffing on `/api/v1/auth/login` | Rate limits, optional CAPTCHA, lockout policies. |</w:t>
+      </w:r>
+    </w:p>
+    <w:p>
+      <w:r>
+        <w:rPr>
+          <w:rFonts w:ascii="Calibri" w:hAnsi="Calibri"/>
+          <w:sz w:val="20"/>
+        </w:rPr>
+        <w:t>| T-02 | Token theft via XSS | Content Security Policy headers (future), HttpOnly cookies, strict React escaping. |</w:t>
+      </w:r>
+    </w:p>
+    <w:p>
+      <w:r>
+        <w:rPr>
+          <w:rFonts w:ascii="Calibri" w:hAnsi="Calibri"/>
+          <w:sz w:val="20"/>
+        </w:rPr>
+        <w:t>| T-03 | CSRF on state-changing routes | SameSite cookies, anti-CSRF tokens if cookie auth without SameSite=strict. |</w:t>
+      </w:r>
+    </w:p>
+    <w:p>
+      <w:r>
+        <w:rPr>
+          <w:rFonts w:ascii="Calibri" w:hAnsi="Calibri"/>
+          <w:sz w:val="20"/>
+        </w:rPr>
+        <w:t>| T-04 | SQL injection | SQLAlchemy bound parameters exclusively. |</w:t>
+      </w:r>
+    </w:p>
+    <w:p>
+      <w:r>
+        <w:rPr>
+          <w:rFonts w:ascii="Calibri" w:hAnsi="Calibri"/>
+          <w:sz w:val="20"/>
+        </w:rPr>
+        <w:t>| T-05 | LLM prompt injection | Sanitize/truncate user text; never execute model output as code. |</w:t>
+      </w:r>
+    </w:p>
+    <w:p>
+      <w:r>
+        <w:rPr>
+          <w:rFonts w:ascii="Calibri" w:hAnsi="Calibri"/>
+          <w:sz w:val="20"/>
+        </w:rPr>
+        <w:t>| T-06 | Webhook spoofing | Verify provider signatures (implement per vendor docs). |</w:t>
+      </w:r>
+    </w:p>
+    <w:p>
+      <w:pPr>
+        <w:pStyle w:val="Heading2"/>
+      </w:pPr>
+      <w:r>
+        <w:t>VII.B. Data classification</w:t>
+      </w:r>
+    </w:p>
+    <w:p>
+      <w:r>
+        <w:t>User emails, OAuth tokens, API key hashes, lead PII, and Calendly payloads are confidential. Logs must redact tokens. Backups must be encrypted at rest.</w:t>
+      </w:r>
+    </w:p>
+    <w:p>
+      <w:pPr>
+        <w:pStyle w:val="Heading2"/>
+      </w:pPr>
+      <w:r>
+        <w:t>VII.C. Compliance note</w:t>
+      </w:r>
+    </w:p>
+    <w:p>
+      <w:r>
+        <w:t>If EU data subjects are onboarded, maintain Records of Processing Activities, DPIA for AI features, and data subject erasure procedures cascading deletes across `users` and dependent rows.</w:t>
       </w:r>
     </w:p>
     <w:p>
@@ -505,12 +955,33 @@
         <w:pStyle w:val="Heading1"/>
       </w:pPr>
       <w:r>
-        <w:t>VIII. TESTING AND VALIDATION</w:t>
+        <w:t>VIII. TESTING AND VALIDATION (EXPANDED)</w:t>
+      </w:r>
+    </w:p>
+    <w:p>
+      <w:pPr>
+        <w:pStyle w:val="Heading2"/>
+      </w:pPr>
+      <w:r>
+        <w:t>VIII.A. Test pyramid</w:t>
       </w:r>
     </w:p>
     <w:p>
       <w:r>
-        <w:t>Recommended layers: unit tests for services, contract tests for API schemas, end-to-end tests for critical flows (registration → login → lead creation), and load tests for webhook bursts. Local validation uses Docker Compose parity with production topology as closely as practical.</w:t>
+        <w:t>Unit: services (pipeline advance rules, campaign triggers). Integration: database transactions with testcontainers Postgres. API: schemathesis or pytest-httpx against OpenAPI. E2E: Playwright flows for register→login→create lead. Load: k6 on read-heavy dashboard endpoints and webhook burst simulations.</w:t>
+      </w:r>
+    </w:p>
+    <w:p>
+      <w:pPr>
+        <w:pStyle w:val="Heading2"/>
+      </w:pPr>
+      <w:r>
+        <w:t>VIII.B. Definition of Done (example)</w:t>
+      </w:r>
+    </w:p>
+    <w:p>
+      <w:r>
+        <w:t>A feature is releasable when: migrations applied; OpenAPI updated; manual smoke on Docker Compose; no P1 linter violations; rollback steps documented.</w:t>
       </w:r>
     </w:p>
     <w:p>
@@ -523,12 +994,17 @@
         <w:pStyle w:val="Heading1"/>
       </w:pPr>
       <w:r>
-        <w:t>IX. LIMITATIONS AND FUTURE WORK</w:t>
+        <w:t>IX. LIMITATIONS AND FUTURE WORK (EXPANDED)</w:t>
       </w:r>
     </w:p>
     <w:p>
       <w:r>
-        <w:t>Limitations include single-region default assumptions, manual multi-tenant partitioning if required later, and operator-dependent configuration of OAuth consent screens. Future work: role-based access control granularity, audit logs export, native mobile clients, and federated identity (SAML/OIDC enterprise SSO).</w:t>
+        <w:t>Current limitations: single-tenant assumptions; no native mobile apps; AI costs variable; Gmail/Calendly setup requires operator expertise; Celery tasks must be monitored for poison messages.</w:t>
+      </w:r>
+    </w:p>
+    <w:p>
+      <w:r>
+        <w:t>Roadmap: multi-tenant row-level security; SAML SSO; billing provider integration; granular RBAC; audit log export; webhook signature verification everywhere; canary deploys.</w:t>
       </w:r>
     </w:p>
     <w:p>
@@ -541,12 +1017,309 @@
         <w:pStyle w:val="Heading1"/>
       </w:pPr>
       <w:r>
-        <w:t>X. CONCLUSION</w:t>
+        <w:t>X. CONCLUSION (EXPANDED)</w:t>
       </w:r>
     </w:p>
     <w:p>
       <w:r>
-        <w:t>GH.ai demonstrates a coherent full-stack architecture suitable for a commercial SaaS MVP: a modern React server environment, a typed Python API, durable PostgreSQL storage, and Redis-backed asynchronous processing. Deployment guidance emphasizes correct Vercel root selection and secure cross-service communication. The platform is positioned for iterative enhancement as customer feedback and telemetry inform product decisions.</w:t>
+        <w:t>GH.ai operationalizes a defensible SaaS architecture: Next.js for user experience and edge-friendly delivery, FastAPI for typed business logic, PostgreSQL for durable state, Redis/Celery for asynchronous work, and explicit integration boundaries for Gmail, Calendly, and LLM vendors. The deployment story—GitHub for source, Vercel for the frontend shell, and portable backend containers—matches how lean teams ship revenue software in 2026. Continued investment in security verification, observability, and customer-driven prioritization will determine commercial outcomes beyond the MVP described herein.</w:t>
+      </w:r>
+    </w:p>
+    <w:p>
+      <w:r>
+        <w:br w:type="page"/>
+      </w:r>
+    </w:p>
+    <w:p>
+      <w:pPr>
+        <w:pStyle w:val="Heading1"/>
+      </w:pPr>
+      <w:r>
+        <w:t>XI. API SURFACE CATALOG (REPRESENTATIVE)</w:t>
+      </w:r>
+    </w:p>
+    <w:p>
+      <w:r>
+        <w:t>The following table summarizes primary versioned REST areas mounted under `/api/v1` (exact paths appear in OpenAPI `/docs`). Webhooks are additional.</w:t>
+      </w:r>
+    </w:p>
+    <w:p>
+      <w:r>
+        <w:rPr>
+          <w:rFonts w:ascii="Calibri" w:hAnsi="Calibri"/>
+          <w:sz w:val="20"/>
+        </w:rPr>
+        <w:t>| Area | Prefix | Notes |</w:t>
+      </w:r>
+    </w:p>
+    <w:p>
+      <w:r>
+        <w:rPr>
+          <w:rFonts w:ascii="Calibri" w:hAnsi="Calibri"/>
+          <w:sz w:val="20"/>
+        </w:rPr>
+        <w:t>|------|--------|------|</w:t>
+      </w:r>
+    </w:p>
+    <w:p>
+      <w:r>
+        <w:rPr>
+          <w:rFonts w:ascii="Calibri" w:hAnsi="Calibri"/>
+          <w:sz w:val="20"/>
+        </w:rPr>
+        <w:t>| Authentication | `/api/v1/auth` | Registration, login, token refresh patterns. |</w:t>
+      </w:r>
+    </w:p>
+    <w:p>
+      <w:r>
+        <w:rPr>
+          <w:rFonts w:ascii="Calibri" w:hAnsi="Calibri"/>
+          <w:sz w:val="20"/>
+        </w:rPr>
+        <w:t>| Users | `/api/v1/users` | `/me` read/update profile. |</w:t>
+      </w:r>
+    </w:p>
+    <w:p>
+      <w:r>
+        <w:rPr>
+          <w:rFonts w:ascii="Calibri" w:hAnsi="Calibri"/>
+          <w:sz w:val="20"/>
+        </w:rPr>
+        <w:t>| Leads | `/api/v1/leads` | CRUD scoped to current user. |</w:t>
+      </w:r>
+    </w:p>
+    <w:p>
+      <w:r>
+        <w:rPr>
+          <w:rFonts w:ascii="Calibri" w:hAnsi="Calibri"/>
+          <w:sz w:val="20"/>
+        </w:rPr>
+        <w:t>| Pipeline | `/api/v1/pipeline` | Stage catalog and advance operations. |</w:t>
+      </w:r>
+    </w:p>
+    <w:p>
+      <w:r>
+        <w:rPr>
+          <w:rFonts w:ascii="Calibri" w:hAnsi="Calibri"/>
+          <w:sz w:val="20"/>
+        </w:rPr>
+        <w:t>| Campaigns | `/api/v1/campaigns` | Triggered outreach definitions. |</w:t>
+      </w:r>
+    </w:p>
+    <w:p>
+      <w:r>
+        <w:rPr>
+          <w:rFonts w:ascii="Calibri" w:hAnsi="Calibri"/>
+          <w:sz w:val="20"/>
+        </w:rPr>
+        <w:t>| AI Agent | `/api/v1/ai-agent` | Generation endpoints. |</w:t>
+      </w:r>
+    </w:p>
+    <w:p>
+      <w:r>
+        <w:rPr>
+          <w:rFonts w:ascii="Calibri" w:hAnsi="Calibri"/>
+          <w:sz w:val="20"/>
+        </w:rPr>
+        <w:t>| Calendly | `/api/v1/calendly` | Connect, event types, booking links, webhook receiver. |</w:t>
+      </w:r>
+    </w:p>
+    <w:p>
+      <w:r>
+        <w:rPr>
+          <w:rFonts w:ascii="Calibri" w:hAnsi="Calibri"/>
+          <w:sz w:val="20"/>
+        </w:rPr>
+        <w:t>| Email | `/api/v1/email` | Sending and logging integration. |</w:t>
+      </w:r>
+    </w:p>
+    <w:p>
+      <w:r>
+        <w:rPr>
+          <w:rFonts w:ascii="Calibri" w:hAnsi="Calibri"/>
+          <w:sz w:val="20"/>
+        </w:rPr>
+        <w:t>| API keys | `/api/v1/api-keys` | Create/list/revoke hashed keys. |</w:t>
+      </w:r>
+    </w:p>
+    <w:p>
+      <w:r>
+        <w:rPr>
+          <w:rFonts w:ascii="Calibri" w:hAnsi="Calibri"/>
+          <w:sz w:val="20"/>
+        </w:rPr>
+        <w:t>| Marketing | `/api/v1/waitlist`, `/api/v1/contact` | Also top-level routes in `main.py`. |</w:t>
+      </w:r>
+    </w:p>
+    <w:p>
+      <w:r>
+        <w:t>Health: `/health` (liveness), `/health/ready` (DB probe).</w:t>
+      </w:r>
+    </w:p>
+    <w:p>
+      <w:r>
+        <w:br w:type="page"/>
+      </w:r>
+    </w:p>
+    <w:p>
+      <w:pPr>
+        <w:pStyle w:val="Heading1"/>
+      </w:pPr>
+      <w:r>
+        <w:t>XII. TRACEABILITY MATRIX (REQUIREMENTS TO COMPONENTS)</w:t>
+      </w:r>
+    </w:p>
+    <w:p>
+      <w:r>
+        <w:rPr>
+          <w:rFonts w:ascii="Calibri" w:hAnsi="Calibri"/>
+          <w:sz w:val="20"/>
+        </w:rPr>
+        <w:t>| Requirement ID | User story | Primary components |</w:t>
+      </w:r>
+    </w:p>
+    <w:p>
+      <w:r>
+        <w:rPr>
+          <w:rFonts w:ascii="Calibri" w:hAnsi="Calibri"/>
+          <w:sz w:val="20"/>
+        </w:rPr>
+        <w:t>|------------------|-----------|---------------------|</w:t>
+      </w:r>
+    </w:p>
+    <w:p>
+      <w:r>
+        <w:rPr>
+          <w:rFonts w:ascii="Calibri" w:hAnsi="Calibri"/>
+          <w:sz w:val="20"/>
+        </w:rPr>
+        <w:t>| FR-01 | Visitor reads marketing pages | Next `(marketing)/*` routes |</w:t>
+      </w:r>
+    </w:p>
+    <w:p>
+      <w:r>
+        <w:rPr>
+          <w:rFonts w:ascii="Calibri" w:hAnsi="Calibri"/>
+          <w:sz w:val="20"/>
+        </w:rPr>
+        <w:t>| FR-02 | Visitor submits waitlist | `POST /api/v1/waitlist`, `WaitlistEntry` |</w:t>
+      </w:r>
+    </w:p>
+    <w:p>
+      <w:r>
+        <w:rPr>
+          <w:rFonts w:ascii="Calibri" w:hAnsi="Calibri"/>
+          <w:sz w:val="20"/>
+        </w:rPr>
+        <w:t>| FR-03 | Visitor contacts founders | `POST /api/v1/contact` |</w:t>
+      </w:r>
+    </w:p>
+    <w:p>
+      <w:r>
+        <w:rPr>
+          <w:rFonts w:ascii="Calibri" w:hAnsi="Calibri"/>
+          <w:sz w:val="20"/>
+        </w:rPr>
+        <w:t>| FR-04 | User registers | Auth router, `users` table |</w:t>
+      </w:r>
+    </w:p>
+    <w:p>
+      <w:r>
+        <w:rPr>
+          <w:rFonts w:ascii="Calibri" w:hAnsi="Calibri"/>
+          <w:sz w:val="20"/>
+        </w:rPr>
+        <w:t>| FR-05 | User logs in | Auth router, cookies/tokens |</w:t>
+      </w:r>
+    </w:p>
+    <w:p>
+      <w:r>
+        <w:rPr>
+          <w:rFonts w:ascii="Calibri" w:hAnsi="Calibri"/>
+          <w:sz w:val="20"/>
+        </w:rPr>
+        <w:t>| FR-06 | User lists leads | `leads` router, dashboard page |</w:t>
+      </w:r>
+    </w:p>
+    <w:p>
+      <w:r>
+        <w:rPr>
+          <w:rFonts w:ascii="Calibri" w:hAnsi="Calibri"/>
+          <w:sz w:val="20"/>
+        </w:rPr>
+        <w:t>| FR-07 | User advances pipeline | `pipeline` router, `Lead.pipeline_stage` |</w:t>
+      </w:r>
+    </w:p>
+    <w:p>
+      <w:r>
+        <w:rPr>
+          <w:rFonts w:ascii="Calibri" w:hAnsi="Calibri"/>
+          <w:sz w:val="20"/>
+        </w:rPr>
+        <w:t>| FR-08 | User defines campaign | `campaigns` router |</w:t>
+      </w:r>
+    </w:p>
+    <w:p>
+      <w:r>
+        <w:rPr>
+          <w:rFonts w:ascii="Calibri" w:hAnsi="Calibri"/>
+          <w:sz w:val="20"/>
+        </w:rPr>
+        <w:t>| FR-09 | User requests AI draft | `ai_agent` router, OpenAI |</w:t>
+      </w:r>
+    </w:p>
+    <w:p>
+      <w:r>
+        <w:rPr>
+          <w:rFonts w:ascii="Calibri" w:hAnsi="Calibri"/>
+          <w:sz w:val="20"/>
+        </w:rPr>
+        <w:t>| FR-10 | User connects Calendly | `calendly` router, token columns |</w:t>
+      </w:r>
+    </w:p>
+    <w:p>
+      <w:r>
+        <w:rPr>
+          <w:rFonts w:ascii="Calibri" w:hAnsi="Calibri"/>
+          <w:sz w:val="20"/>
+        </w:rPr>
+        <w:t>| FR-11 | System receives Calendly webhook | `webhooks`, `CalendlyEvent` |</w:t>
+      </w:r>
+    </w:p>
+    <w:p>
+      <w:r>
+        <w:rPr>
+          <w:rFonts w:ascii="Calibri" w:hAnsi="Calibri"/>
+          <w:sz w:val="20"/>
+        </w:rPr>
+        <w:t>| FR-12 | Background email send | Celery tasks, Gmail |</w:t>
+      </w:r>
+    </w:p>
+    <w:p>
+      <w:r>
+        <w:rPr>
+          <w:rFonts w:ascii="Calibri" w:hAnsi="Calibri"/>
+          <w:sz w:val="20"/>
+        </w:rPr>
+        <w:t>| FR-13 | Admin monitors health | `/health`, `/health/ready` |</w:t>
+      </w:r>
+    </w:p>
+    <w:p>
+      <w:r>
+        <w:br w:type="page"/>
+      </w:r>
+    </w:p>
+    <w:p>
+      <w:pPr>
+        <w:pStyle w:val="Heading1"/>
+      </w:pPr>
+      <w:r>
+        <w:t>XIII. GLOSSARY (EXTENDED)</w:t>
+      </w:r>
+    </w:p>
+    <w:p>
+      <w:r>
+        <w:t>ASGI: Asynchronous Server Gateway Interface standard underpinning Uvicorn+FastAPI. JSONB: PostgreSQL binary JSON column type used for flexible payloads (`ai_config`, `raw_payload`). ORM: Object-relational mapper (SQLAlchemy). SSR: Server-side rendering. ISR: Incremental static regeneration (available in Next where configured). Webhook: HTTP POST callback from SaaS providers on events.</w:t>
       </w:r>
     </w:p>
     <w:p>

</xml_diff>